<commit_message>
Fixed Edit modal by placing Date label and date picker on the same line for a better design.
</commit_message>
<xml_diff>
--- a/docs/phase4/dollar_doodle_tasklist.docx
+++ b/docs/phase4/dollar_doodle_tasklist.docx
@@ -999,6 +999,7 @@
         <w:tc>
           <w:tcPr>
             <w:tcW w:w="2700" w:type="dxa"/>
+            <w:shd w:val="clear" w:color="auto" w:fill="8DD873" w:themeFill="accent6" w:themeFillTint="99"/>
           </w:tcPr>
           <w:p>
             <w:pPr>
@@ -1018,25 +1019,41 @@
         <w:tc>
           <w:tcPr>
             <w:tcW w:w="3600" w:type="dxa"/>
-          </w:tcPr>
-          <w:p>
-            <w:pPr>
-              <w:jc w:val="both"/>
-              <w:rPr>
-                <w:rFonts w:ascii="Times New Roman" w:hAnsi="Times New Roman" w:cs="Times New Roman"/>
-              </w:rPr>
-            </w:pPr>
-            <w:r>
-              <w:rPr>
-                <w:rFonts w:ascii="Times New Roman" w:hAnsi="Times New Roman" w:cs="Times New Roman"/>
-              </w:rPr>
-              <w:t>Date isn’t in a good spot so we need to adjust the spot</w:t>
+            <w:shd w:val="clear" w:color="auto" w:fill="8DD873" w:themeFill="accent6" w:themeFillTint="99"/>
+          </w:tcPr>
+          <w:p>
+            <w:pPr>
+              <w:jc w:val="both"/>
+              <w:rPr>
+                <w:rFonts w:ascii="Times New Roman" w:hAnsi="Times New Roman" w:cs="Times New Roman"/>
+              </w:rPr>
+            </w:pPr>
+            <w:r>
+              <w:rPr>
+                <w:rFonts w:ascii="Times New Roman" w:hAnsi="Times New Roman" w:cs="Times New Roman"/>
+              </w:rPr>
+              <w:t xml:space="preserve">Date isn’t in a good </w:t>
+            </w:r>
+            <w:proofErr w:type="gramStart"/>
+            <w:r>
+              <w:rPr>
+                <w:rFonts w:ascii="Times New Roman" w:hAnsi="Times New Roman" w:cs="Times New Roman"/>
+              </w:rPr>
+              <w:t>spot</w:t>
+            </w:r>
+            <w:proofErr w:type="gramEnd"/>
+            <w:r>
+              <w:rPr>
+                <w:rFonts w:ascii="Times New Roman" w:hAnsi="Times New Roman" w:cs="Times New Roman"/>
+              </w:rPr>
+              <w:t xml:space="preserve"> so we need to adjust the spot</w:t>
             </w:r>
           </w:p>
         </w:tc>
         <w:tc>
           <w:tcPr>
             <w:tcW w:w="1260" w:type="dxa"/>
+            <w:shd w:val="clear" w:color="auto" w:fill="8DD873" w:themeFill="accent6" w:themeFillTint="99"/>
           </w:tcPr>
           <w:p>
             <w:pPr>
@@ -1056,27 +1073,41 @@
         <w:tc>
           <w:tcPr>
             <w:tcW w:w="1440" w:type="dxa"/>
-          </w:tcPr>
-          <w:p>
-            <w:pPr>
-              <w:jc w:val="both"/>
-              <w:rPr>
-                <w:rFonts w:ascii="Times New Roman" w:hAnsi="Times New Roman" w:cs="Times New Roman"/>
-              </w:rPr>
-            </w:pPr>
+            <w:shd w:val="clear" w:color="auto" w:fill="8DD873" w:themeFill="accent6" w:themeFillTint="99"/>
+          </w:tcPr>
+          <w:p>
+            <w:pPr>
+              <w:jc w:val="both"/>
+              <w:rPr>
+                <w:rFonts w:ascii="Times New Roman" w:hAnsi="Times New Roman" w:cs="Times New Roman"/>
+              </w:rPr>
+            </w:pPr>
+            <w:r>
+              <w:rPr>
+                <w:rFonts w:ascii="Times New Roman" w:hAnsi="Times New Roman" w:cs="Times New Roman"/>
+              </w:rPr>
+              <w:t>Roma</w:t>
+            </w:r>
           </w:p>
         </w:tc>
         <w:tc>
           <w:tcPr>
             <w:tcW w:w="1890" w:type="dxa"/>
-          </w:tcPr>
-          <w:p>
-            <w:pPr>
-              <w:jc w:val="both"/>
-              <w:rPr>
-                <w:rFonts w:ascii="Times New Roman" w:hAnsi="Times New Roman" w:cs="Times New Roman"/>
-              </w:rPr>
-            </w:pPr>
+            <w:shd w:val="clear" w:color="auto" w:fill="8DD873" w:themeFill="accent6" w:themeFillTint="99"/>
+          </w:tcPr>
+          <w:p>
+            <w:pPr>
+              <w:jc w:val="both"/>
+              <w:rPr>
+                <w:rFonts w:ascii="Times New Roman" w:hAnsi="Times New Roman" w:cs="Times New Roman"/>
+              </w:rPr>
+            </w:pPr>
+            <w:r>
+              <w:rPr>
+                <w:rFonts w:ascii="Times New Roman" w:hAnsi="Times New Roman" w:cs="Times New Roman"/>
+              </w:rPr>
+              <w:t>04/25/2026</w:t>
+            </w:r>
           </w:p>
         </w:tc>
       </w:tr>

</xml_diff>

<commit_message>
update dollar doodle task list
</commit_message>
<xml_diff>
--- a/docs/phase4/dollar_doodle_tasklist.docx
+++ b/docs/phase4/dollar_doodle_tasklist.docx
@@ -11,16 +11,16 @@
         <w:tblLook w:val="04A0" w:firstRow="1" w:lastRow="0" w:firstColumn="1" w:lastColumn="0" w:noHBand="0" w:noVBand="1"/>
       </w:tblPr>
       <w:tblGrid>
-        <w:gridCol w:w="2700"/>
-        <w:gridCol w:w="3600"/>
+        <w:gridCol w:w="2160"/>
+        <w:gridCol w:w="4140"/>
         <w:gridCol w:w="1260"/>
-        <w:gridCol w:w="1440"/>
-        <w:gridCol w:w="1890"/>
+        <w:gridCol w:w="1211"/>
+        <w:gridCol w:w="2119"/>
       </w:tblGrid>
       <w:tr>
         <w:tc>
           <w:tcPr>
-            <w:tcW w:w="2700" w:type="dxa"/>
+            <w:tcW w:w="2160" w:type="dxa"/>
           </w:tcPr>
           <w:p>
             <w:pPr>
@@ -41,7 +41,7 @@
         </w:tc>
         <w:tc>
           <w:tcPr>
-            <w:tcW w:w="3600" w:type="dxa"/>
+            <w:tcW w:w="4140" w:type="dxa"/>
           </w:tcPr>
           <w:p>
             <w:pPr>
@@ -83,7 +83,7 @@
         </w:tc>
         <w:tc>
           <w:tcPr>
-            <w:tcW w:w="1440" w:type="dxa"/>
+            <w:tcW w:w="1211" w:type="dxa"/>
           </w:tcPr>
           <w:p>
             <w:pPr>
@@ -104,7 +104,7 @@
         </w:tc>
         <w:tc>
           <w:tcPr>
-            <w:tcW w:w="1890" w:type="dxa"/>
+            <w:tcW w:w="2119" w:type="dxa"/>
           </w:tcPr>
           <w:p>
             <w:pPr>
@@ -127,7 +127,7 @@
       <w:tr>
         <w:tc>
           <w:tcPr>
-            <w:tcW w:w="2700" w:type="dxa"/>
+            <w:tcW w:w="2160" w:type="dxa"/>
           </w:tcPr>
           <w:p>
             <w:pPr>
@@ -146,7 +146,7 @@
         </w:tc>
         <w:tc>
           <w:tcPr>
-            <w:tcW w:w="3600" w:type="dxa"/>
+            <w:tcW w:w="4140" w:type="dxa"/>
           </w:tcPr>
           <w:p>
             <w:pPr>
@@ -184,7 +184,7 @@
         </w:tc>
         <w:tc>
           <w:tcPr>
-            <w:tcW w:w="1440" w:type="dxa"/>
+            <w:tcW w:w="1211" w:type="dxa"/>
           </w:tcPr>
           <w:p>
             <w:pPr>
@@ -203,7 +203,7 @@
         </w:tc>
         <w:tc>
           <w:tcPr>
-            <w:tcW w:w="1890" w:type="dxa"/>
+            <w:tcW w:w="2119" w:type="dxa"/>
           </w:tcPr>
           <w:p>
             <w:pPr>
@@ -218,7 +218,7 @@
       <w:tr>
         <w:tc>
           <w:tcPr>
-            <w:tcW w:w="2700" w:type="dxa"/>
+            <w:tcW w:w="2160" w:type="dxa"/>
           </w:tcPr>
           <w:p>
             <w:pPr>
@@ -237,7 +237,7 @@
         </w:tc>
         <w:tc>
           <w:tcPr>
-            <w:tcW w:w="3600" w:type="dxa"/>
+            <w:tcW w:w="4140" w:type="dxa"/>
           </w:tcPr>
           <w:p>
             <w:pPr>
@@ -275,7 +275,7 @@
         </w:tc>
         <w:tc>
           <w:tcPr>
-            <w:tcW w:w="1440" w:type="dxa"/>
+            <w:tcW w:w="1211" w:type="dxa"/>
           </w:tcPr>
           <w:p>
             <w:pPr>
@@ -294,7 +294,7 @@
         </w:tc>
         <w:tc>
           <w:tcPr>
-            <w:tcW w:w="1890" w:type="dxa"/>
+            <w:tcW w:w="2119" w:type="dxa"/>
           </w:tcPr>
           <w:p>
             <w:pPr>
@@ -309,7 +309,7 @@
       <w:tr>
         <w:tc>
           <w:tcPr>
-            <w:tcW w:w="2700" w:type="dxa"/>
+            <w:tcW w:w="2160" w:type="dxa"/>
             <w:shd w:val="clear" w:color="auto" w:fill="8DD873" w:themeFill="accent6" w:themeFillTint="99"/>
           </w:tcPr>
           <w:p>
@@ -329,7 +329,7 @@
         </w:tc>
         <w:tc>
           <w:tcPr>
-            <w:tcW w:w="3600" w:type="dxa"/>
+            <w:tcW w:w="4140" w:type="dxa"/>
             <w:shd w:val="clear" w:color="auto" w:fill="8DD873" w:themeFill="accent6" w:themeFillTint="99"/>
           </w:tcPr>
           <w:p>
@@ -369,7 +369,7 @@
         </w:tc>
         <w:tc>
           <w:tcPr>
-            <w:tcW w:w="1440" w:type="dxa"/>
+            <w:tcW w:w="1211" w:type="dxa"/>
             <w:shd w:val="clear" w:color="auto" w:fill="8DD873" w:themeFill="accent6" w:themeFillTint="99"/>
           </w:tcPr>
           <w:p>
@@ -389,7 +389,7 @@
         </w:tc>
         <w:tc>
           <w:tcPr>
-            <w:tcW w:w="1890" w:type="dxa"/>
+            <w:tcW w:w="2119" w:type="dxa"/>
             <w:shd w:val="clear" w:color="auto" w:fill="8DD873" w:themeFill="accent6" w:themeFillTint="99"/>
           </w:tcPr>
           <w:p>
@@ -411,7 +411,7 @@
       <w:tr>
         <w:tc>
           <w:tcPr>
-            <w:tcW w:w="2700" w:type="dxa"/>
+            <w:tcW w:w="2160" w:type="dxa"/>
           </w:tcPr>
           <w:p>
             <w:pPr>
@@ -430,7 +430,7 @@
         </w:tc>
         <w:tc>
           <w:tcPr>
-            <w:tcW w:w="3600" w:type="dxa"/>
+            <w:tcW w:w="4140" w:type="dxa"/>
           </w:tcPr>
           <w:p>
             <w:pPr>
@@ -468,7 +468,7 @@
         </w:tc>
         <w:tc>
           <w:tcPr>
-            <w:tcW w:w="1440" w:type="dxa"/>
+            <w:tcW w:w="1211" w:type="dxa"/>
           </w:tcPr>
           <w:p>
             <w:pPr>
@@ -487,7 +487,7 @@
         </w:tc>
         <w:tc>
           <w:tcPr>
-            <w:tcW w:w="1890" w:type="dxa"/>
+            <w:tcW w:w="2119" w:type="dxa"/>
           </w:tcPr>
           <w:p>
             <w:pPr>
@@ -502,7 +502,8 @@
       <w:tr>
         <w:tc>
           <w:tcPr>
-            <w:tcW w:w="2700" w:type="dxa"/>
+            <w:tcW w:w="2160" w:type="dxa"/>
+            <w:shd w:val="clear" w:color="auto" w:fill="FFFF00"/>
           </w:tcPr>
           <w:p>
             <w:pPr>
@@ -527,7 +528,8 @@
         </w:tc>
         <w:tc>
           <w:tcPr>
-            <w:tcW w:w="3600" w:type="dxa"/>
+            <w:tcW w:w="4140" w:type="dxa"/>
+            <w:shd w:val="clear" w:color="auto" w:fill="FFFF00"/>
           </w:tcPr>
           <w:p>
             <w:pPr>
@@ -553,59 +555,68 @@
         <w:tc>
           <w:tcPr>
             <w:tcW w:w="1260" w:type="dxa"/>
-          </w:tcPr>
-          <w:p>
-            <w:pPr>
-              <w:jc w:val="both"/>
-              <w:rPr>
-                <w:rFonts w:ascii="Times New Roman" w:hAnsi="Times New Roman" w:cs="Times New Roman"/>
-              </w:rPr>
-            </w:pPr>
-            <w:r>
-              <w:rPr>
-                <w:rFonts w:ascii="Times New Roman" w:hAnsi="Times New Roman" w:cs="Times New Roman"/>
-              </w:rPr>
-              <w:t>3</w:t>
-            </w:r>
-          </w:p>
-        </w:tc>
-        <w:tc>
-          <w:tcPr>
-            <w:tcW w:w="1440" w:type="dxa"/>
-          </w:tcPr>
-          <w:p>
-            <w:pPr>
-              <w:jc w:val="both"/>
-              <w:rPr>
-                <w:rFonts w:ascii="Times New Roman" w:hAnsi="Times New Roman" w:cs="Times New Roman"/>
-              </w:rPr>
-            </w:pPr>
-            <w:r>
-              <w:rPr>
-                <w:rFonts w:ascii="Times New Roman" w:hAnsi="Times New Roman" w:cs="Times New Roman"/>
-              </w:rPr>
-              <w:t>Roma</w:t>
-            </w:r>
-          </w:p>
-        </w:tc>
-        <w:tc>
-          <w:tcPr>
-            <w:tcW w:w="1890" w:type="dxa"/>
-          </w:tcPr>
-          <w:p>
-            <w:pPr>
-              <w:jc w:val="both"/>
-              <w:rPr>
-                <w:rFonts w:ascii="Times New Roman" w:hAnsi="Times New Roman" w:cs="Times New Roman"/>
-              </w:rPr>
-            </w:pPr>
+            <w:shd w:val="clear" w:color="auto" w:fill="FFFF00"/>
+          </w:tcPr>
+          <w:p>
+            <w:pPr>
+              <w:jc w:val="center"/>
+              <w:rPr>
+                <w:rFonts w:ascii="Times New Roman" w:hAnsi="Times New Roman" w:cs="Times New Roman"/>
+              </w:rPr>
+            </w:pPr>
+            <w:r>
+              <w:rPr>
+                <w:rFonts w:ascii="Times New Roman" w:hAnsi="Times New Roman" w:cs="Times New Roman"/>
+              </w:rPr>
+              <w:t>-</w:t>
+            </w:r>
+          </w:p>
+        </w:tc>
+        <w:tc>
+          <w:tcPr>
+            <w:tcW w:w="1211" w:type="dxa"/>
+            <w:shd w:val="clear" w:color="auto" w:fill="FFFF00"/>
+          </w:tcPr>
+          <w:p>
+            <w:pPr>
+              <w:jc w:val="center"/>
+              <w:rPr>
+                <w:rFonts w:ascii="Times New Roman" w:hAnsi="Times New Roman" w:cs="Times New Roman"/>
+              </w:rPr>
+            </w:pPr>
+            <w:r>
+              <w:rPr>
+                <w:rFonts w:ascii="Times New Roman" w:hAnsi="Times New Roman" w:cs="Times New Roman"/>
+              </w:rPr>
+              <w:t>-</w:t>
+            </w:r>
+          </w:p>
+        </w:tc>
+        <w:tc>
+          <w:tcPr>
+            <w:tcW w:w="2119" w:type="dxa"/>
+            <w:shd w:val="clear" w:color="auto" w:fill="FFFF00"/>
+          </w:tcPr>
+          <w:p>
+            <w:pPr>
+              <w:jc w:val="both"/>
+              <w:rPr>
+                <w:rFonts w:ascii="Times New Roman" w:hAnsi="Times New Roman" w:cs="Times New Roman"/>
+              </w:rPr>
+            </w:pPr>
+            <w:r>
+              <w:rPr>
+                <w:rFonts w:ascii="Times New Roman" w:hAnsi="Times New Roman" w:cs="Times New Roman"/>
+              </w:rPr>
+              <w:t>Team member decided to move on this specific task since it may take so much time and we may need to change the whole design of the dashboard</w:t>
+            </w:r>
           </w:p>
         </w:tc>
       </w:tr>
       <w:tr>
         <w:tc>
           <w:tcPr>
-            <w:tcW w:w="2700" w:type="dxa"/>
+            <w:tcW w:w="2160" w:type="dxa"/>
             <w:shd w:val="clear" w:color="auto" w:fill="8DD873" w:themeFill="accent6" w:themeFillTint="99"/>
           </w:tcPr>
           <w:p>
@@ -625,7 +636,7 @@
         </w:tc>
         <w:tc>
           <w:tcPr>
-            <w:tcW w:w="3600" w:type="dxa"/>
+            <w:tcW w:w="4140" w:type="dxa"/>
             <w:shd w:val="clear" w:color="auto" w:fill="8DD873" w:themeFill="accent6" w:themeFillTint="99"/>
           </w:tcPr>
           <w:p>
@@ -683,7 +694,7 @@
         </w:tc>
         <w:tc>
           <w:tcPr>
-            <w:tcW w:w="1440" w:type="dxa"/>
+            <w:tcW w:w="1211" w:type="dxa"/>
             <w:shd w:val="clear" w:color="auto" w:fill="8DD873" w:themeFill="accent6" w:themeFillTint="99"/>
           </w:tcPr>
           <w:p>
@@ -703,7 +714,7 @@
         </w:tc>
         <w:tc>
           <w:tcPr>
-            <w:tcW w:w="1890" w:type="dxa"/>
+            <w:tcW w:w="2119" w:type="dxa"/>
             <w:shd w:val="clear" w:color="auto" w:fill="8DD873" w:themeFill="accent6" w:themeFillTint="99"/>
           </w:tcPr>
           <w:p>
@@ -725,7 +736,7 @@
       <w:tr>
         <w:tc>
           <w:tcPr>
-            <w:tcW w:w="2700" w:type="dxa"/>
+            <w:tcW w:w="2160" w:type="dxa"/>
           </w:tcPr>
           <w:p>
             <w:pPr>
@@ -744,7 +755,7 @@
         </w:tc>
         <w:tc>
           <w:tcPr>
-            <w:tcW w:w="3600" w:type="dxa"/>
+            <w:tcW w:w="4140" w:type="dxa"/>
           </w:tcPr>
           <w:p>
             <w:pPr>
@@ -782,7 +793,7 @@
         </w:tc>
         <w:tc>
           <w:tcPr>
-            <w:tcW w:w="1440" w:type="dxa"/>
+            <w:tcW w:w="1211" w:type="dxa"/>
           </w:tcPr>
           <w:p>
             <w:pPr>
@@ -801,7 +812,7 @@
         </w:tc>
         <w:tc>
           <w:tcPr>
-            <w:tcW w:w="1890" w:type="dxa"/>
+            <w:tcW w:w="2119" w:type="dxa"/>
           </w:tcPr>
           <w:p>
             <w:pPr>
@@ -816,7 +827,7 @@
       <w:tr>
         <w:tc>
           <w:tcPr>
-            <w:tcW w:w="2700" w:type="dxa"/>
+            <w:tcW w:w="2160" w:type="dxa"/>
           </w:tcPr>
           <w:p>
             <w:pPr>
@@ -835,7 +846,7 @@
         </w:tc>
         <w:tc>
           <w:tcPr>
-            <w:tcW w:w="3600" w:type="dxa"/>
+            <w:tcW w:w="4140" w:type="dxa"/>
           </w:tcPr>
           <w:p>
             <w:pPr>
@@ -873,7 +884,7 @@
         </w:tc>
         <w:tc>
           <w:tcPr>
-            <w:tcW w:w="1440" w:type="dxa"/>
+            <w:tcW w:w="1211" w:type="dxa"/>
           </w:tcPr>
           <w:p>
             <w:pPr>
@@ -892,7 +903,7 @@
         </w:tc>
         <w:tc>
           <w:tcPr>
-            <w:tcW w:w="1890" w:type="dxa"/>
+            <w:tcW w:w="2119" w:type="dxa"/>
           </w:tcPr>
           <w:p>
             <w:pPr>
@@ -907,7 +918,7 @@
       <w:tr>
         <w:tc>
           <w:tcPr>
-            <w:tcW w:w="2700" w:type="dxa"/>
+            <w:tcW w:w="2160" w:type="dxa"/>
           </w:tcPr>
           <w:p>
             <w:pPr>
@@ -926,7 +937,7 @@
         </w:tc>
         <w:tc>
           <w:tcPr>
-            <w:tcW w:w="3600" w:type="dxa"/>
+            <w:tcW w:w="4140" w:type="dxa"/>
           </w:tcPr>
           <w:p>
             <w:pPr>
@@ -964,7 +975,7 @@
         </w:tc>
         <w:tc>
           <w:tcPr>
-            <w:tcW w:w="1440" w:type="dxa"/>
+            <w:tcW w:w="1211" w:type="dxa"/>
           </w:tcPr>
           <w:p>
             <w:pPr>
@@ -983,7 +994,7 @@
         </w:tc>
         <w:tc>
           <w:tcPr>
-            <w:tcW w:w="1890" w:type="dxa"/>
+            <w:tcW w:w="2119" w:type="dxa"/>
           </w:tcPr>
           <w:p>
             <w:pPr>
@@ -998,7 +1009,7 @@
       <w:tr>
         <w:tc>
           <w:tcPr>
-            <w:tcW w:w="2700" w:type="dxa"/>
+            <w:tcW w:w="2160" w:type="dxa"/>
             <w:shd w:val="clear" w:color="auto" w:fill="8DD873" w:themeFill="accent6" w:themeFillTint="99"/>
           </w:tcPr>
           <w:p>
@@ -1018,7 +1029,7 @@
         </w:tc>
         <w:tc>
           <w:tcPr>
-            <w:tcW w:w="3600" w:type="dxa"/>
+            <w:tcW w:w="4140" w:type="dxa"/>
             <w:shd w:val="clear" w:color="auto" w:fill="8DD873" w:themeFill="accent6" w:themeFillTint="99"/>
           </w:tcPr>
           <w:p>
@@ -1034,14 +1045,12 @@
               </w:rPr>
               <w:t xml:space="preserve">Date isn’t in a good </w:t>
             </w:r>
-            <w:proofErr w:type="gramStart"/>
-            <w:r>
-              <w:rPr>
-                <w:rFonts w:ascii="Times New Roman" w:hAnsi="Times New Roman" w:cs="Times New Roman"/>
-              </w:rPr>
-              <w:t>spot</w:t>
-            </w:r>
-            <w:proofErr w:type="gramEnd"/>
+            <w:r>
+              <w:rPr>
+                <w:rFonts w:ascii="Times New Roman" w:hAnsi="Times New Roman" w:cs="Times New Roman"/>
+              </w:rPr>
+              <w:t>spot,</w:t>
+            </w:r>
             <w:r>
               <w:rPr>
                 <w:rFonts w:ascii="Times New Roman" w:hAnsi="Times New Roman" w:cs="Times New Roman"/>
@@ -1072,7 +1081,7 @@
         </w:tc>
         <w:tc>
           <w:tcPr>
-            <w:tcW w:w="1440" w:type="dxa"/>
+            <w:tcW w:w="1211" w:type="dxa"/>
             <w:shd w:val="clear" w:color="auto" w:fill="8DD873" w:themeFill="accent6" w:themeFillTint="99"/>
           </w:tcPr>
           <w:p>
@@ -1092,7 +1101,7 @@
         </w:tc>
         <w:tc>
           <w:tcPr>
-            <w:tcW w:w="1890" w:type="dxa"/>
+            <w:tcW w:w="2119" w:type="dxa"/>
             <w:shd w:val="clear" w:color="auto" w:fill="8DD873" w:themeFill="accent6" w:themeFillTint="99"/>
           </w:tcPr>
           <w:p>

</xml_diff>

<commit_message>
update task list with my tasks
</commit_message>
<xml_diff>
--- a/docs/phase4/dollar_doodle_tasklist.docx
+++ b/docs/phase4/dollar_doodle_tasklist.docx
@@ -345,6 +345,26 @@
               </w:rPr>
               <w:t>Allow the user to filter transactions by certain fields</w:t>
             </w:r>
+            <w:r>
+              <w:rPr>
+                <w:rFonts w:ascii="Times New Roman" w:hAnsi="Times New Roman" w:cs="Times New Roman"/>
+              </w:rPr>
+              <w:t xml:space="preserve"> </w:t>
+            </w:r>
+            <w:proofErr w:type="gramStart"/>
+            <w:r>
+              <w:rPr>
+                <w:rFonts w:ascii="Times New Roman" w:hAnsi="Times New Roman" w:cs="Times New Roman"/>
+              </w:rPr>
+              <w:t>( categories</w:t>
+            </w:r>
+            <w:proofErr w:type="gramEnd"/>
+            <w:r>
+              <w:rPr>
+                <w:rFonts w:ascii="Times New Roman" w:hAnsi="Times New Roman" w:cs="Times New Roman"/>
+              </w:rPr>
+              <w:t xml:space="preserve"> and date)</w:t>
+            </w:r>
           </w:p>
         </w:tc>
         <w:tc>
@@ -404,6 +424,20 @@
                 <w:rFonts w:ascii="Times New Roman" w:hAnsi="Times New Roman" w:cs="Times New Roman"/>
               </w:rPr>
               <w:t>04/21/2026</w:t>
+            </w:r>
+          </w:p>
+          <w:p>
+            <w:pPr>
+              <w:jc w:val="both"/>
+              <w:rPr>
+                <w:rFonts w:ascii="Times New Roman" w:hAnsi="Times New Roman" w:cs="Times New Roman"/>
+              </w:rPr>
+            </w:pPr>
+            <w:r>
+              <w:rPr>
+                <w:rFonts w:ascii="Times New Roman" w:hAnsi="Times New Roman" w:cs="Times New Roman"/>
+              </w:rPr>
+              <w:t>04/29/2026</w:t>
             </w:r>
           </w:p>
         </w:tc>
@@ -611,7 +645,19 @@
               <w:rPr>
                 <w:rFonts w:ascii="Times New Roman" w:hAnsi="Times New Roman" w:cs="Times New Roman"/>
               </w:rPr>
-              <w:t xml:space="preserve">Team member decided </w:t>
+              <w:t>Team member</w:t>
+            </w:r>
+            <w:r>
+              <w:rPr>
+                <w:rFonts w:ascii="Times New Roman" w:hAnsi="Times New Roman" w:cs="Times New Roman"/>
+              </w:rPr>
+              <w:t>s</w:t>
+            </w:r>
+            <w:r>
+              <w:rPr>
+                <w:rFonts w:ascii="Times New Roman" w:hAnsi="Times New Roman" w:cs="Times New Roman"/>
+              </w:rPr>
+              <w:t xml:space="preserve"> decided </w:t>
             </w:r>
             <w:r>
               <w:rPr>

</xml_diff>